<commit_message>
Improve thesis report and PoC evidence
Refresh the dashboard presentation and document the latest injection and network observations with accurately scoped claims.

Co-authored-by: Cursor <cursoragent@cursor.com>
</commit_message>
<xml_diff>
--- a/thesis/thong-tin-luan-van.docx
+++ b/thesis/thong-tin-luan-van.docx
@@ -2,7 +2,7 @@
 <file path=word/document.xml><?xml version="1.0" encoding="utf-8"?>
 <w:document xmlns:w="http://schemas.openxmlformats.org/wordprocessingml/2006/main" xmlns:m="http://schemas.openxmlformats.org/officeDocument/2006/math" xmlns:r="http://schemas.openxmlformats.org/officeDocument/2006/relationships" xmlns:o="urn:schemas-microsoft-com:office:office" xmlns:v="urn:schemas-microsoft-com:vml" xmlns:w10="urn:schemas-microsoft-com:office:word" xmlns:a="http://schemas.openxmlformats.org/drawingml/2006/main" xmlns:pic="http://schemas.openxmlformats.org/drawingml/2006/picture" xmlns:wp="http://schemas.openxmlformats.org/drawingml/2006/wordprocessingDrawing">
   <w:body>
-    <w:bookmarkStart w:id="11" w:name="thông-tin-về-luận-văn-thạc-sĩ"/>
+    <w:bookmarkStart w:id="112" w:name="thông-tin-về-luận-văn-thạc-sĩ"/>
     <w:p>
       <w:pPr>
         <w:pStyle w:val="Heading1"/>
@@ -70,7 +70,7 @@
         </w:pict>
       </w:r>
     </w:p>
-    <w:bookmarkStart w:id="9" w:name="thông-tin-về-luận-văn-thạc-sĩ-1"/>
+    <w:bookmarkStart w:id="110" w:name="thông-tin-về-luận-văn-thạc-sĩ-1"/>
     <w:p>
       <w:pPr>
         <w:pStyle w:val="Heading2"/>
@@ -97,7 +97,7 @@
         <w:t xml:space="preserve"> </w:t>
       </w:r>
       <w:r>
-        <w:t xml:space="preserve">Phan Vinh Cơ</w:t>
+        <w:t xml:space="preserve">Phan Văn Cơ</w:t>
       </w:r>
       <w:r>
         <w:br/>
@@ -261,7 +261,7 @@
           <w:b/>
           <w:bCs/>
         </w:rPr>
-        <w:t xml:space="preserve">Tăng cường phát hiện mã độc dưới các hình thức né tránh</w:t>
+        <w:t xml:space="preserve">Tăng cường phát hiện mã độc trước các kĩ thuật né tránh</w:t>
       </w:r>
       <w:r>
         <w:br/>
@@ -511,8 +511,8 @@
         </w:pict>
       </w:r>
     </w:p>
-    <w:bookmarkEnd w:id="9"/>
-    <w:bookmarkStart w:id="10" w:name="information-on-masters-thesis"/>
+    <w:bookmarkEnd w:id="110"/>
+    <w:bookmarkStart w:id="111" w:name="information-on-masters-thesis"/>
     <w:p>
       <w:pPr>
         <w:pStyle w:val="Heading2"/>
@@ -579,7 +579,7 @@
         <w:t xml:space="preserve"> </w:t>
       </w:r>
       <w:r>
-        <w:t xml:space="preserve">Phan Vinh Co</w:t>
+        <w:t xml:space="preserve">Phan Van Co</w:t>
       </w:r>
       <w:r>
         <w:br/>
@@ -957,12 +957,19 @@
         </w:pict>
       </w:r>
     </w:p>
-    <w:bookmarkEnd w:id="10"/>
-    <w:bookmarkEnd w:id="11"/>
+    <w:bookmarkEnd w:id="111"/>
+    <w:bookmarkEnd w:id="112"/>
     <w:sectPr>
+      <w:headerReference r:id="rId100" w:type="default"/>
+      <w:headerReference r:id="rId101" w:type="first"/>
       <w:footnotePr>
         <w:numRestart w:val="eachSect"/>
       </w:footnotePr>
+      <w:pgSz w:h="16838" w:w="11906"/>
+      <w:pgMar w:bottom="1134" w:footer="567" w:gutter="0" w:header="567" w:left="1701" w:right="1134" w:top="1134"/>
+      <w:titlePg/>
+      <w:cols w:space="708"/>
+      <w:docGrid w:linePitch="360"/>
     </w:sectPr>
   </w:body>
 </w:document>
@@ -989,6 +996,42 @@
     </w:p>
   </w:footnote>
 </w:footnotes>
+</file>
+
+<file path=word/header1.xml><?xml version="1.0" encoding="utf-8"?>
+<w:hdr xmlns:w="http://schemas.openxmlformats.org/wordprocessingml/2006/main">
+  <w:p>
+    <w:pPr>
+      <w:pStyle w:val="Header"/>
+      <w:jc w:val="center"/>
+    </w:pPr>
+    <w:r>
+      <w:fldChar w:fldCharType="begin"/>
+    </w:r>
+    <w:r>
+      <w:instrText xml:space="preserve"> PAGE </w:instrText>
+    </w:r>
+    <w:r>
+      <w:fldChar w:fldCharType="separate"/>
+    </w:r>
+    <w:r>
+      <w:t>1</w:t>
+    </w:r>
+    <w:r>
+      <w:fldChar w:fldCharType="end"/>
+    </w:r>
+  </w:p>
+</w:hdr>
+</file>
+
+<file path=word/header2.xml><?xml version="1.0" encoding="utf-8"?>
+<w:hdr xmlns:w="http://schemas.openxmlformats.org/wordprocessingml/2006/main">
+  <w:p>
+    <w:pPr>
+      <w:pStyle w:val="Header"/>
+    </w:pPr>
+  </w:p>
+</w:hdr>
 </file>
 
 <file path=word/numbering.xml><?xml version="1.0" encoding="utf-8"?>
@@ -1225,15 +1268,15 @@
   <w:docDefaults>
     <w:rPrDefault>
       <w:rPr>
-        <w:rFonts w:asciiTheme="minorHAnsi" w:cstheme="minorBidi" w:eastAsiaTheme="minorEastAsia" w:hAnsiTheme="minorHAnsi"/>
-        <w:sz w:val="24"/>
-        <w:szCs w:val="24"/>
-        <w:lang w:bidi="ar-SA" w:eastAsia="zh-CN" w:val="en-US"/>
+        <w:rFonts w:ascii="Times New Roman" w:cs="Times New Roman" w:eastAsia="Times New Roman" w:hAnsi="Times New Roman"/>
+        <w:sz w:val="26"/>
+        <w:szCs w:val="26"/>
+        <w:lang w:bidi="ar-SA" w:eastAsia="vi-VN" w:val="vi-VN"/>
       </w:rPr>
     </w:rPrDefault>
     <w:pPrDefault>
       <w:pPr>
-        <w:spacing w:after="200"/>
+        <w:spacing w:after="120" w:line="288" w:lineRule="auto"/>
       </w:pPr>
     </w:pPrDefault>
   </w:docDefaults>
@@ -1241,6 +1284,14 @@
   <w:style w:default="1" w:styleId="Normal" w:type="paragraph">
     <w:name w:val="Normal"/>
     <w:qFormat/>
+    <w:pPr>
+      <w:jc w:val="both"/>
+    </w:pPr>
+    <w:rPr>
+      <w:rFonts w:ascii="Times New Roman" w:cs="Times New Roman" w:eastAsia="Times New Roman" w:hAnsi="Times New Roman"/>
+      <w:sz w:val="26"/>
+      <w:szCs w:val="26"/>
+    </w:rPr>
   </w:style>
   <w:style w:styleId="BodyText" w:type="paragraph">
     <w:name w:val="Body Text"/>
@@ -1324,7 +1375,7 @@
     <w:rsid w:val="00A10FD9"/>
     <w:rPr>
       <w:rFonts w:cstheme="majorBidi" w:eastAsiaTheme="majorEastAsia"/>
-      <w:color w:themeColor="text1" w:themeTint="A6" w:val="595959"/>
+      <w:color w:val="000000"/>
       <w:spacing w:val="15"/>
       <w:sz w:val="28"/>
       <w:szCs w:val="28"/>
@@ -1409,14 +1460,17 @@
     <w:pPr>
       <w:keepNext/>
       <w:keepLines/>
+      <w:pageBreakBefore/>
       <w:spacing w:after="80" w:before="360"/>
+      <w:jc w:val="center"/>
       <w:outlineLvl w:val="0"/>
     </w:pPr>
     <w:rPr>
-      <w:rFonts w:asciiTheme="majorHAnsi" w:cstheme="majorBidi" w:eastAsiaTheme="majorEastAsia" w:hAnsiTheme="majorHAnsi"/>
-      <w:color w:themeColor="accent1" w:themeShade="BF" w:val="0F4761"/>
-      <w:sz w:val="40"/>
-      <w:szCs w:val="40"/>
+      <w:rFonts w:ascii="Times New Roman" w:cs="Times New Roman" w:eastAsia="Times New Roman" w:hAnsi="Times New Roman"/>
+      <w:b/>
+      <w:color w:val="000000"/>
+      <w:sz w:val="28"/>
+      <w:szCs w:val="28"/>
     </w:rPr>
   </w:style>
   <w:style w:styleId="Heading2" w:type="paragraph">
@@ -1436,10 +1490,11 @@
       <w:outlineLvl w:val="1"/>
     </w:pPr>
     <w:rPr>
-      <w:rFonts w:asciiTheme="majorHAnsi" w:cstheme="majorBidi" w:eastAsiaTheme="majorEastAsia" w:hAnsiTheme="majorHAnsi"/>
-      <w:color w:themeColor="accent1" w:themeShade="BF" w:val="0F4761"/>
-      <w:sz w:val="32"/>
-      <w:szCs w:val="32"/>
+      <w:rFonts w:ascii="Times New Roman" w:cs="Times New Roman" w:eastAsia="Times New Roman" w:hAnsi="Times New Roman"/>
+      <w:b/>
+      <w:color w:val="000000"/>
+      <w:sz w:val="26"/>
+      <w:szCs w:val="26"/>
     </w:rPr>
   </w:style>
   <w:style w:styleId="Heading3" w:type="paragraph">
@@ -1459,10 +1514,12 @@
       <w:outlineLvl w:val="2"/>
     </w:pPr>
     <w:rPr>
-      <w:rFonts w:cstheme="majorBidi" w:eastAsiaTheme="majorEastAsia"/>
-      <w:color w:themeColor="accent1" w:themeShade="BF" w:val="0F4761"/>
-      <w:sz w:val="28"/>
-      <w:szCs w:val="28"/>
+      <w:rFonts w:ascii="Times New Roman" w:cs="Times New Roman" w:eastAsia="Times New Roman" w:hAnsi="Times New Roman"/>
+      <w:b/>
+      <w:i/>
+      <w:color w:val="000000"/>
+      <w:sz w:val="26"/>
+      <w:szCs w:val="26"/>
     </w:rPr>
   </w:style>
   <w:style w:styleId="Heading4" w:type="paragraph">
@@ -1482,10 +1539,12 @@
       <w:outlineLvl w:val="3"/>
     </w:pPr>
     <w:rPr>
-      <w:rFonts w:cstheme="majorBidi" w:eastAsiaTheme="majorEastAsia"/>
+      <w:rFonts w:ascii="Times New Roman" w:cs="Times New Roman" w:eastAsia="Times New Roman" w:hAnsi="Times New Roman"/>
+      <w:b/>
       <w:i/>
-      <w:iCs/>
-      <w:color w:themeColor="accent1" w:themeShade="BF" w:val="0F4761"/>
+      <w:color w:val="000000"/>
+      <w:sz w:val="26"/>
+      <w:szCs w:val="26"/>
     </w:rPr>
   </w:style>
   <w:style w:styleId="Heading5" w:type="paragraph">
@@ -1505,8 +1564,11 @@
       <w:outlineLvl w:val="4"/>
     </w:pPr>
     <w:rPr>
-      <w:rFonts w:cstheme="majorBidi" w:eastAsiaTheme="majorEastAsia"/>
-      <w:color w:themeColor="accent1" w:themeShade="BF" w:val="0F4761"/>
+      <w:rFonts w:ascii="Times New Roman" w:cs="Times New Roman" w:eastAsia="Times New Roman" w:hAnsi="Times New Roman"/>
+      <w:b/>
+      <w:color w:val="000000"/>
+      <w:sz w:val="26"/>
+      <w:szCs w:val="26"/>
     </w:rPr>
   </w:style>
   <w:style w:styleId="Heading6" w:type="paragraph">
@@ -1526,10 +1588,11 @@
       <w:outlineLvl w:val="5"/>
     </w:pPr>
     <w:rPr>
-      <w:rFonts w:cstheme="majorBidi" w:eastAsiaTheme="majorEastAsia"/>
-      <w:i/>
-      <w:iCs/>
-      <w:color w:themeColor="text1" w:themeTint="A6" w:val="595959"/>
+      <w:rFonts w:ascii="Times New Roman" w:cs="Times New Roman" w:eastAsia="Times New Roman" w:hAnsi="Times New Roman"/>
+      <w:b/>
+      <w:color w:val="000000"/>
+      <w:sz w:val="26"/>
+      <w:szCs w:val="26"/>
     </w:rPr>
   </w:style>
   <w:style w:styleId="Heading7" w:type="paragraph">
@@ -1549,8 +1612,11 @@
       <w:outlineLvl w:val="6"/>
     </w:pPr>
     <w:rPr>
-      <w:rFonts w:cstheme="majorBidi" w:eastAsiaTheme="majorEastAsia"/>
-      <w:color w:themeColor="text1" w:themeTint="A6" w:val="595959"/>
+      <w:rFonts w:ascii="Times New Roman" w:cs="Times New Roman" w:eastAsia="Times New Roman" w:hAnsi="Times New Roman"/>
+      <w:b/>
+      <w:color w:val="000000"/>
+      <w:sz w:val="26"/>
+      <w:szCs w:val="26"/>
     </w:rPr>
   </w:style>
   <w:style w:styleId="Heading8" w:type="paragraph">
@@ -1570,10 +1636,11 @@
       <w:outlineLvl w:val="7"/>
     </w:pPr>
     <w:rPr>
-      <w:rFonts w:cstheme="majorBidi" w:eastAsiaTheme="majorEastAsia"/>
-      <w:i/>
-      <w:iCs/>
-      <w:color w:themeColor="text1" w:themeTint="D8" w:val="272727"/>
+      <w:rFonts w:ascii="Times New Roman" w:cs="Times New Roman" w:eastAsia="Times New Roman" w:hAnsi="Times New Roman"/>
+      <w:b/>
+      <w:color w:val="000000"/>
+      <w:sz w:val="26"/>
+      <w:szCs w:val="26"/>
     </w:rPr>
   </w:style>
   <w:style w:styleId="Heading9" w:type="paragraph">
@@ -1593,8 +1660,11 @@
       <w:outlineLvl w:val="8"/>
     </w:pPr>
     <w:rPr>
-      <w:rFonts w:cstheme="majorBidi" w:eastAsiaTheme="majorEastAsia"/>
-      <w:color w:themeColor="text1" w:themeTint="D8" w:val="272727"/>
+      <w:rFonts w:ascii="Times New Roman" w:cs="Times New Roman" w:eastAsia="Times New Roman" w:hAnsi="Times New Roman"/>
+      <w:b/>
+      <w:color w:val="000000"/>
+      <w:sz w:val="26"/>
+      <w:szCs w:val="26"/>
     </w:rPr>
   </w:style>
   <w:style w:customStyle="1" w:styleId="Heading1Char" w:type="character">
@@ -1605,7 +1675,7 @@
     <w:rsid w:val="00A10FD9"/>
     <w:rPr>
       <w:rFonts w:asciiTheme="majorHAnsi" w:cstheme="majorBidi" w:eastAsiaTheme="majorEastAsia" w:hAnsiTheme="majorHAnsi"/>
-      <w:color w:themeColor="accent1" w:themeShade="BF" w:val="0F4761"/>
+      <w:color w:val="000000"/>
       <w:sz w:val="40"/>
       <w:szCs w:val="40"/>
     </w:rPr>
@@ -1619,7 +1689,7 @@
     <w:rsid w:val="00A10FD9"/>
     <w:rPr>
       <w:rFonts w:asciiTheme="majorHAnsi" w:cstheme="majorBidi" w:eastAsiaTheme="majorEastAsia" w:hAnsiTheme="majorHAnsi"/>
-      <w:color w:themeColor="accent1" w:themeShade="BF" w:val="0F4761"/>
+      <w:color w:val="000000"/>
       <w:sz w:val="32"/>
       <w:szCs w:val="32"/>
     </w:rPr>
@@ -1633,7 +1703,7 @@
     <w:rsid w:val="00A10FD9"/>
     <w:rPr>
       <w:rFonts w:cstheme="majorBidi" w:eastAsiaTheme="majorEastAsia"/>
-      <w:color w:themeColor="accent1" w:themeShade="BF" w:val="0F4761"/>
+      <w:color w:val="000000"/>
       <w:sz w:val="28"/>
       <w:szCs w:val="28"/>
     </w:rPr>
@@ -1649,7 +1719,7 @@
       <w:rFonts w:cstheme="majorBidi" w:eastAsiaTheme="majorEastAsia"/>
       <w:i/>
       <w:iCs/>
-      <w:color w:themeColor="accent1" w:themeShade="BF" w:val="0F4761"/>
+      <w:color w:val="000000"/>
     </w:rPr>
   </w:style>
   <w:style w:customStyle="1" w:styleId="Heading5Char" w:type="character">
@@ -1661,7 +1731,7 @@
     <w:rsid w:val="00A10FD9"/>
     <w:rPr>
       <w:rFonts w:cstheme="majorBidi" w:eastAsiaTheme="majorEastAsia"/>
-      <w:color w:themeColor="accent1" w:themeShade="BF" w:val="0F4761"/>
+      <w:color w:val="000000"/>
     </w:rPr>
   </w:style>
   <w:style w:customStyle="1" w:styleId="Heading6Char" w:type="character">
@@ -1675,7 +1745,7 @@
       <w:rFonts w:cstheme="majorBidi" w:eastAsiaTheme="majorEastAsia"/>
       <w:i/>
       <w:iCs/>
-      <w:color w:themeColor="text1" w:themeTint="A6" w:val="595959"/>
+      <w:color w:val="000000"/>
     </w:rPr>
   </w:style>
   <w:style w:customStyle="1" w:styleId="Heading7Char" w:type="character">
@@ -1687,7 +1757,7 @@
     <w:rsid w:val="00A10FD9"/>
     <w:rPr>
       <w:rFonts w:cstheme="majorBidi" w:eastAsiaTheme="majorEastAsia"/>
-      <w:color w:themeColor="text1" w:themeTint="A6" w:val="595959"/>
+      <w:color w:val="000000"/>
     </w:rPr>
   </w:style>
   <w:style w:customStyle="1" w:styleId="Heading8Char" w:type="character">
@@ -1701,7 +1771,7 @@
       <w:rFonts w:cstheme="majorBidi" w:eastAsiaTheme="majorEastAsia"/>
       <w:i/>
       <w:iCs/>
-      <w:color w:themeColor="text1" w:themeTint="D8" w:val="272727"/>
+      <w:color w:val="000000"/>
     </w:rPr>
   </w:style>
   <w:style w:customStyle="1" w:styleId="Heading9Char" w:type="character">
@@ -1713,7 +1783,7 @@
     <w:rsid w:val="00A10FD9"/>
     <w:rPr>
       <w:rFonts w:cstheme="majorBidi" w:eastAsiaTheme="majorEastAsia"/>
-      <w:color w:themeColor="text1" w:themeTint="D8" w:val="272727"/>
+      <w:color w:val="000000"/>
     </w:rPr>
   </w:style>
   <w:style w:styleId="BlockText" w:type="paragraph">
@@ -1800,6 +1870,7 @@
     <w:link w:val="BodyTextChar"/>
     <w:pPr>
       <w:spacing w:after="120" w:before="0"/>
+      <w:jc w:val="center"/>
     </w:pPr>
     <w:rPr>
       <w:i/>
@@ -1810,11 +1881,15 @@
     <w:basedOn w:val="Caption"/>
     <w:pPr>
       <w:keepNext/>
+      <w:jc w:val="center"/>
     </w:pPr>
   </w:style>
   <w:style w:customStyle="1" w:styleId="ImageCaption" w:type="paragraph">
     <w:name w:val="Image Caption"/>
     <w:basedOn w:val="Caption"/>
+    <w:pPr>
+      <w:jc w:val="center"/>
+    </w:pPr>
   </w:style>
   <w:style w:customStyle="1" w:styleId="Figure" w:type="paragraph">
     <w:name w:val="Figure"/>
@@ -1855,7 +1930,7 @@
     <w:name w:val="Hyperlink"/>
     <w:basedOn w:val="BodyTextChar"/>
     <w:rPr>
-      <w:color w:themeColor="accent1" w:val="4F81BD"/>
+      <w:color w:val="000000"/>
     </w:rPr>
   </w:style>
   <w:style w:styleId="TOCHeading" w:type="paragraph">
@@ -1870,11 +1945,21 @@
       <w:outlineLvl w:val="9"/>
     </w:pPr>
     <w:rPr>
-      <w:rFonts w:asciiTheme="majorHAnsi" w:cstheme="majorBidi" w:eastAsiaTheme="majorEastAsia" w:hAnsiTheme="majorHAnsi"/>
-      <w:b w:val="0"/>
-      <w:bCs w:val="0"/>
-      <w:color w:themeColor="accent1" w:themeShade="BF" w:val="365F91"/>
-    </w:rPr>
+      <w:rFonts w:ascii="Times New Roman" w:cs="Times New Roman" w:eastAsia="Times New Roman" w:hAnsi="Times New Roman"/>
+      <w:sz w:val="28"/>
+      <w:szCs w:val="28"/>
+      <w:b/>
+      <w:bCs/>
+      <w:color w:val="000000"/>
+    </w:rPr>
+  </w:style>
+  <w:style w:styleId="Header" w:type="paragraph">
+    <w:name w:val="header"/>
+    <w:basedOn w:val="Normal"/>
+    <w:pPr>
+      <w:spacing w:after="0" w:line="240" w:lineRule="auto"/>
+      <w:jc w:val="center"/>
+    </w:pPr>
   </w:style>
   <w:style w:type="paragraph" w:customStyle="1" w:styleId="SourceCode">
     <w:name w:val="Source Code"/>
@@ -2156,7 +2241,7 @@
     </a:clrScheme>
     <a:fontScheme name="Office">
       <a:majorFont>
-        <a:latin typeface="Aptos Display" panose="02110004020202020204"/>
+        <a:latin typeface="Times New Roman" panose="02110004020202020204"/>
         <a:ea typeface=""/>
         <a:cs typeface=""/>
         <a:font script="Jpan" typeface="游ゴシック Light"/>
@@ -2208,7 +2293,7 @@
         <a:font script="Tfng" typeface="Ebrima"/>
       </a:majorFont>
       <a:minorFont>
-        <a:latin typeface="Aptos" panose="02110004020202020204"/>
+        <a:latin typeface="Times New Roman" panose="02110004020202020204"/>
         <a:ea typeface=""/>
         <a:cs typeface=""/>
         <a:font script="Jpan" typeface="游明朝"/>

</xml_diff>